<commit_message>
16/07/26 -  nav bar design
</commit_message>
<xml_diff>
--- a/Web app/Assessment/Work log.docx
+++ b/Web app/Assessment/Work log.docx
@@ -290,7 +290,7 @@
                 <w:noProof/>
               </w:rPr>
               <w:drawing>
-                <wp:anchor distT="0" distB="0" distL="114300" distR="114300" simplePos="0" relativeHeight="251666432" behindDoc="0" locked="0" layoutInCell="1" allowOverlap="1" wp14:anchorId="46E2FF26" wp14:editId="69DD8358">
+                <wp:anchor distT="0" distB="0" distL="114300" distR="114300" simplePos="0" relativeHeight="251666432" behindDoc="0" locked="0" layoutInCell="1" allowOverlap="1" wp14:anchorId="46E2FF26" wp14:editId="36E2006E">
                   <wp:simplePos x="0" y="0"/>
                   <wp:positionH relativeFrom="column">
                     <wp:posOffset>2179955</wp:posOffset>
@@ -738,7 +738,7 @@
                 <w:noProof/>
               </w:rPr>
               <w:drawing>
-                <wp:anchor distT="0" distB="0" distL="114300" distR="114300" simplePos="0" relativeHeight="251673600" behindDoc="0" locked="0" layoutInCell="1" allowOverlap="1" wp14:anchorId="0A9F1F63" wp14:editId="4F5F29E7">
+                <wp:anchor distT="0" distB="0" distL="114300" distR="114300" simplePos="0" relativeHeight="251673600" behindDoc="0" locked="0" layoutInCell="1" allowOverlap="1" wp14:anchorId="0A9F1F63" wp14:editId="144BB16B">
                   <wp:simplePos x="0" y="0"/>
                   <wp:positionH relativeFrom="column">
                     <wp:posOffset>2077289</wp:posOffset>
@@ -875,19 +875,158 @@
           <w:tcPr>
             <w:tcW w:w="1696" w:type="dxa"/>
           </w:tcPr>
-          <w:p/>
+          <w:p>
+            <w:r>
+              <w:t>24/06/2026</w:t>
+            </w:r>
+          </w:p>
         </w:tc>
         <w:tc>
           <w:tcPr>
             <w:tcW w:w="6521" w:type="dxa"/>
           </w:tcPr>
-          <w:p/>
+          <w:p>
+            <w:r>
+              <w:t xml:space="preserve">Today, After I had finished the camera to pick up on </w:t>
+            </w:r>
+            <w:r>
+              <w:t>barcodes,</w:t>
+            </w:r>
+            <w:r>
+              <w:t xml:space="preserve"> I thought that I would add a navigation bar</w:t>
+            </w:r>
+            <w:r>
+              <w:t xml:space="preserve">. After </w:t>
+            </w:r>
+            <w:r>
+              <w:t>looking at some mobile websites and apps,</w:t>
+            </w:r>
+            <w:r>
+              <w:t xml:space="preserve"> I decided to put my navigation bar at the bottom of my screen</w:t>
+            </w:r>
+            <w:r>
+              <w:t xml:space="preserve">. Doing this it would make the website to feel more user friendly as it would be </w:t>
+            </w:r>
+            <w:r>
+              <w:t xml:space="preserve">to swap to different pages </w:t>
+            </w:r>
+            <w:proofErr w:type="gramStart"/>
+            <w:r>
+              <w:t>and also</w:t>
+            </w:r>
+            <w:proofErr w:type="gramEnd"/>
+            <w:r>
+              <w:t xml:space="preserve"> matches the aesthetic of the page having it there. Today, I </w:t>
+            </w:r>
+            <w:r>
+              <w:lastRenderedPageBreak/>
+              <w:t xml:space="preserve">got started in it but since I have not done this </w:t>
+            </w:r>
+            <w:r>
+              <w:t xml:space="preserve">concept in a while I did not get it finished today, but I did but in the </w:t>
+            </w:r>
+            <w:r>
+              <w:t>nav statement to create the box on where my icons are going to got to swap pages for my smart attendance app</w:t>
+            </w:r>
+            <w:r>
+              <w:t xml:space="preserve">. My next step is to </w:t>
+            </w:r>
+            <w:r>
+              <w:t>properly</w:t>
+            </w:r>
+            <w:r>
+              <w:t xml:space="preserve"> to create the next page </w:t>
+            </w:r>
+            <w:r>
+              <w:t xml:space="preserve">and then add it to my navigation bar, once I have done </w:t>
+            </w:r>
+            <w:proofErr w:type="gramStart"/>
+            <w:r>
+              <w:t>that</w:t>
+            </w:r>
+            <w:proofErr w:type="gramEnd"/>
+            <w:r>
+              <w:t xml:space="preserve"> I can change the colour and the aesthetic of the things on my </w:t>
+            </w:r>
+            <w:r>
+              <w:t>navigation bar and then I can start to code the next page.</w:t>
+            </w:r>
+          </w:p>
         </w:tc>
         <w:tc>
           <w:tcPr>
             <w:tcW w:w="7171" w:type="dxa"/>
           </w:tcPr>
-          <w:p/>
+          <w:p>
+            <w:r>
+              <w:rPr>
+                <w:noProof/>
+              </w:rPr>
+              <w:lastRenderedPageBreak/>
+              <w:drawing>
+                <wp:anchor distT="0" distB="0" distL="114300" distR="114300" simplePos="0" relativeHeight="251675648" behindDoc="0" locked="0" layoutInCell="1" allowOverlap="1" wp14:anchorId="19520D02" wp14:editId="566A821D">
+                  <wp:simplePos x="0" y="0"/>
+                  <wp:positionH relativeFrom="column">
+                    <wp:posOffset>110587</wp:posOffset>
+                  </wp:positionH>
+                  <wp:positionV relativeFrom="paragraph">
+                    <wp:posOffset>108865</wp:posOffset>
+                  </wp:positionV>
+                  <wp:extent cx="1741170" cy="983615"/>
+                  <wp:effectExtent l="0" t="0" r="0" b="6985"/>
+                  <wp:wrapSquare wrapText="bothSides"/>
+                  <wp:docPr id="1699725266" name="Picture 1"/>
+                  <wp:cNvGraphicFramePr>
+                    <a:graphicFrameLocks xmlns:a="http://schemas.openxmlformats.org/drawingml/2006/main" noChangeAspect="1"/>
+                  </wp:cNvGraphicFramePr>
+                  <a:graphic xmlns:a="http://schemas.openxmlformats.org/drawingml/2006/main">
+                    <a:graphicData uri="http://schemas.openxmlformats.org/drawingml/2006/picture">
+                      <pic:pic xmlns:pic="http://schemas.openxmlformats.org/drawingml/2006/picture">
+                        <pic:nvPicPr>
+                          <pic:cNvPr id="0" name="Picture 1"/>
+                          <pic:cNvPicPr>
+                            <a:picLocks noChangeAspect="1" noChangeArrowheads="1"/>
+                          </pic:cNvPicPr>
+                        </pic:nvPicPr>
+                        <pic:blipFill>
+                          <a:blip r:embed="rId13" cstate="print">
+                            <a:extLst>
+                              <a:ext uri="{28A0092B-C50C-407E-A947-70E740481C1C}">
+                                <a14:useLocalDpi xmlns:a14="http://schemas.microsoft.com/office/drawing/2010/main" val="0"/>
+                              </a:ext>
+                            </a:extLst>
+                          </a:blip>
+                          <a:srcRect/>
+                          <a:stretch>
+                            <a:fillRect/>
+                          </a:stretch>
+                        </pic:blipFill>
+                        <pic:spPr bwMode="auto">
+                          <a:xfrm>
+                            <a:off x="0" y="0"/>
+                            <a:ext cx="1741170" cy="983615"/>
+                          </a:xfrm>
+                          <a:prstGeom prst="rect">
+                            <a:avLst/>
+                          </a:prstGeom>
+                          <a:noFill/>
+                          <a:ln>
+                            <a:noFill/>
+                          </a:ln>
+                        </pic:spPr>
+                      </pic:pic>
+                    </a:graphicData>
+                  </a:graphic>
+                  <wp14:sizeRelH relativeFrom="margin">
+                    <wp14:pctWidth>0</wp14:pctWidth>
+                  </wp14:sizeRelH>
+                  <wp14:sizeRelV relativeFrom="margin">
+                    <wp14:pctHeight>0</wp14:pctHeight>
+                  </wp14:sizeRelV>
+                </wp:anchor>
+              </w:drawing>
+            </w:r>
+          </w:p>
         </w:tc>
       </w:tr>
       <w:tr>
@@ -895,7 +1034,11 @@
           <w:tcPr>
             <w:tcW w:w="1696" w:type="dxa"/>
           </w:tcPr>
-          <w:p/>
+          <w:p>
+            <w:r>
+              <w:t>25/06/2026</w:t>
+            </w:r>
+          </w:p>
         </w:tc>
         <w:tc>
           <w:tcPr>
@@ -915,7 +1058,11 @@
           <w:tcPr>
             <w:tcW w:w="1696" w:type="dxa"/>
           </w:tcPr>
-          <w:p/>
+          <w:p>
+            <w:r>
+              <w:t>26/06/2026</w:t>
+            </w:r>
+          </w:p>
         </w:tc>
         <w:tc>
           <w:tcPr>
@@ -1092,7 +1239,213 @@
       </w:tr>
     </w:tbl>
     <w:p/>
-    <w:p/>
+    <w:tbl>
+      <w:tblPr>
+        <w:tblStyle w:val="TableGrid"/>
+        <w:tblW w:w="0" w:type="auto"/>
+        <w:tblLook w:val="04A0" w:firstRow="1" w:lastRow="0" w:firstColumn="1" w:lastColumn="0" w:noHBand="0" w:noVBand="1"/>
+      </w:tblPr>
+      <w:tblGrid>
+        <w:gridCol w:w="1555"/>
+        <w:gridCol w:w="2268"/>
+        <w:gridCol w:w="2126"/>
+        <w:gridCol w:w="2693"/>
+        <w:gridCol w:w="3119"/>
+        <w:gridCol w:w="1338"/>
+        <w:gridCol w:w="2170"/>
+      </w:tblGrid>
+      <w:tr>
+        <w:tc>
+          <w:tcPr>
+            <w:tcW w:w="1555" w:type="dxa"/>
+          </w:tcPr>
+          <w:p>
+            <w:pPr>
+              <w:rPr>
+                <w:b/>
+                <w:bCs/>
+              </w:rPr>
+            </w:pPr>
+            <w:r>
+              <w:rPr>
+                <w:b/>
+                <w:bCs/>
+              </w:rPr>
+              <w:t>UI par</w:t>
+            </w:r>
+            <w:r>
+              <w:rPr>
+                <w:b/>
+                <w:bCs/>
+              </w:rPr>
+              <w:t>t:</w:t>
+            </w:r>
+          </w:p>
+        </w:tc>
+        <w:tc>
+          <w:tcPr>
+            <w:tcW w:w="2268" w:type="dxa"/>
+          </w:tcPr>
+          <w:p>
+            <w:pPr>
+              <w:rPr>
+                <w:b/>
+                <w:bCs/>
+              </w:rPr>
+            </w:pPr>
+            <w:r>
+              <w:rPr>
+                <w:b/>
+                <w:bCs/>
+              </w:rPr>
+              <w:t>What has been tested</w:t>
+            </w:r>
+            <w:r>
+              <w:rPr>
+                <w:b/>
+                <w:bCs/>
+              </w:rPr>
+              <w:t>:</w:t>
+            </w:r>
+          </w:p>
+        </w:tc>
+        <w:tc>
+          <w:tcPr>
+            <w:tcW w:w="2126" w:type="dxa"/>
+          </w:tcPr>
+          <w:p>
+            <w:pPr>
+              <w:rPr>
+                <w:b/>
+                <w:bCs/>
+              </w:rPr>
+            </w:pPr>
+            <w:r>
+              <w:rPr>
+                <w:b/>
+                <w:bCs/>
+              </w:rPr>
+              <w:t>Test input/ action</w:t>
+            </w:r>
+            <w:r>
+              <w:rPr>
+                <w:b/>
+                <w:bCs/>
+              </w:rPr>
+              <w:t>:</w:t>
+            </w:r>
+          </w:p>
+        </w:tc>
+        <w:tc>
+          <w:tcPr>
+            <w:tcW w:w="2693" w:type="dxa"/>
+          </w:tcPr>
+          <w:p>
+            <w:pPr>
+              <w:rPr>
+                <w:b/>
+                <w:bCs/>
+              </w:rPr>
+            </w:pPr>
+            <w:r>
+              <w:rPr>
+                <w:b/>
+                <w:bCs/>
+              </w:rPr>
+              <w:t>Expected result</w:t>
+            </w:r>
+            <w:r>
+              <w:rPr>
+                <w:b/>
+                <w:bCs/>
+              </w:rPr>
+              <w:t>:</w:t>
+            </w:r>
+          </w:p>
+        </w:tc>
+        <w:tc>
+          <w:tcPr>
+            <w:tcW w:w="3119" w:type="dxa"/>
+          </w:tcPr>
+          <w:p>
+            <w:pPr>
+              <w:rPr>
+                <w:b/>
+                <w:bCs/>
+              </w:rPr>
+            </w:pPr>
+            <w:r>
+              <w:rPr>
+                <w:b/>
+                <w:bCs/>
+              </w:rPr>
+              <w:t>Actual result</w:t>
+            </w:r>
+            <w:r>
+              <w:rPr>
+                <w:b/>
+                <w:bCs/>
+              </w:rPr>
+              <w:t>:</w:t>
+            </w:r>
+            <w:r>
+              <w:rPr>
+                <w:b/>
+                <w:bCs/>
+              </w:rPr>
+              <w:t xml:space="preserve"> </w:t>
+            </w:r>
+          </w:p>
+        </w:tc>
+        <w:tc>
+          <w:tcPr>
+            <w:tcW w:w="1338" w:type="dxa"/>
+          </w:tcPr>
+          <w:p>
+            <w:pPr>
+              <w:rPr>
+                <w:b/>
+                <w:bCs/>
+              </w:rPr>
+            </w:pPr>
+            <w:r>
+              <w:rPr>
+                <w:b/>
+                <w:bCs/>
+              </w:rPr>
+              <w:t>Pass/fail</w:t>
+            </w:r>
+          </w:p>
+        </w:tc>
+        <w:tc>
+          <w:tcPr>
+            <w:tcW w:w="2170" w:type="dxa"/>
+          </w:tcPr>
+          <w:p>
+            <w:pPr>
+              <w:rPr>
+                <w:b/>
+                <w:bCs/>
+              </w:rPr>
+            </w:pPr>
+            <w:r>
+              <w:rPr>
+                <w:b/>
+                <w:bCs/>
+              </w:rPr>
+              <w:t>Notes/ changes made</w:t>
+            </w:r>
+            <w:r>
+              <w:rPr>
+                <w:b/>
+                <w:bCs/>
+              </w:rPr>
+              <w:t>:</w:t>
+            </w:r>
+          </w:p>
+        </w:tc>
+      </w:tr>
+    </w:tbl>
     <w:p/>
     <w:p/>
     <w:p>
@@ -1245,7 +1598,7 @@
                           </pic:cNvPicPr>
                         </pic:nvPicPr>
                         <pic:blipFill>
-                          <a:blip r:embed="rId13" cstate="print">
+                          <a:blip r:embed="rId14" cstate="print">
                             <a:extLst>
                               <a:ext uri="{28A0092B-C50C-407E-A947-70E740481C1C}">
                                 <a14:useLocalDpi xmlns:a14="http://schemas.microsoft.com/office/drawing/2010/main" val="0"/>

</xml_diff>